<commit_message>
feat: brand system overhaul — new fonts, color tokens, and text hierarchy
Replace DM Sans/DM Serif with Plus Jakarta Sans, Fraunces, Space Grotesk,
and Space Mono. Introduce COLOR and TEXT constants as single source of truth,
migrate 130+ components from opacity-based INK hierarchy to semantic text
colors (primary/secondary/tertiary/accent/inverse), and update globals.css
with new CSS custom properties.

Co-Authored-By: Claude Opus 4.6 <noreply@anthropic.com>
</commit_message>
<xml_diff>
--- a/Terrazzo_Follow_On_Requirements_Updated.docx
+++ b/Terrazzo_Follow_On_Requirements_Updated.docx
@@ -183,20 +183,7 @@
           <w:sz w:val="22"/>
           <w:szCs w:val="22"/>
         </w:rPr>
-        <w:t xml:space="preserve">Status: </w:t>
-      </w:r>
-      <w:r>
-        <w:rPr>
-          <w:rFonts w:ascii="Arial" w:cs="Arial" w:eastAsia="Arial" w:hAnsi="Arial"/>
-          <w:b/>
-          <w:bCs/>
-          <w:i w:val="false"/>
-          <w:iCs w:val="false"/>
-          <w:color w:val="2D8659"/>
-          <w:sz w:val="22"/>
-          <w:szCs w:val="22"/>
-        </w:rPr>
-        <w:t xml:space="preserve">DONE</w:t>
+        <w:t>Status: DONE</w:t>
       </w:r>
       <w:r>
         <w:rPr>
@@ -619,7 +606,7 @@
           <w:sz w:val="22"/>
           <w:szCs w:val="22"/>
         </w:rPr>
-        <w:t xml:space="preserve"> All 7 new columns added and populated by the 12-stage enrichment pipeline.</w:t>
+        <w:t xml:space="preserve"> All 7 new columns added and populated by the 10-stage enrichment pipeline.</w:t>
       </w:r>
     </w:p>
     <w:p>
@@ -638,7 +625,7 @@
           <w:sz w:val="22"/>
           <w:szCs w:val="22"/>
         </w:rPr>
-        <w:t xml:space="preserve">rhythmProfile: Json? — populated by rhythm_analysis stage</w:t>
+        <w:t xml:space="preserve">sustainabilityScore: Float? — populated by sustainability_analysis stage</w:t>
       </w:r>
     </w:p>
     <w:p>
@@ -657,7 +644,7 @@
           <w:sz w:val="22"/>
           <w:szCs w:val="22"/>
         </w:rPr>
-        <w:t xml:space="preserve">sustainabilityScore: Float? — populated by sustainability_analysis stage</w:t>
+        <w:t xml:space="preserve">sustainabilityFeatures: String[] — populated by sustainability_analysis stage</w:t>
       </w:r>
     </w:p>
     <w:p>
@@ -676,7 +663,7 @@
           <w:sz w:val="22"/>
           <w:szCs w:val="22"/>
         </w:rPr>
-        <w:t xml:space="preserve">sustainabilityFeatures: String[] — populated by sustainability_analysis stage</w:t>
+        <w:t xml:space="preserve">sensoryCues: Json? — populated by sensory_analysis stage (was missing, now built)</w:t>
       </w:r>
     </w:p>
     <w:p>
@@ -695,63 +682,6 @@
           <w:sz w:val="22"/>
           <w:szCs w:val="22"/>
         </w:rPr>
-        <w:t xml:space="preserve">culturalEngagementOptions: String[] — populated by cultural_engagement_analysis stage</w:t>
-      </w:r>
-    </w:p>
-    <w:p>
-      <w:pPr>
-        <w:pStyle w:val="ListParagraph"/>
-        <w:numPr>
-          <w:ilvl w:val="0"/>
-          <w:numId w:val="3"/>
-        </w:numPr>
-        <w:spacing w:after="80"/>
-      </w:pPr>
-      <w:r>
-        <w:rPr>
-          <w:rFonts w:ascii="Arial" w:cs="Arial" w:eastAsia="Arial" w:hAnsi="Arial"/>
-          <w:color w:val="333333"/>
-          <w:sz w:val="22"/>
-          <w:szCs w:val="22"/>
-        </w:rPr>
-        <w:t xml:space="preserve">sensoryCues: Json? — populated by sensory_analysis stage (was missing, now built)</w:t>
-      </w:r>
-    </w:p>
-    <w:p>
-      <w:pPr>
-        <w:pStyle w:val="ListParagraph"/>
-        <w:numPr>
-          <w:ilvl w:val="0"/>
-          <w:numId w:val="3"/>
-        </w:numPr>
-        <w:spacing w:after="80"/>
-      </w:pPr>
-      <w:r>
-        <w:rPr>
-          <w:rFonts w:ascii="Arial" w:cs="Arial" w:eastAsia="Arial" w:hAnsi="Arial"/>
-          <w:color w:val="333333"/>
-          <w:sz w:val="22"/>
-          <w:szCs w:val="22"/>
-        </w:rPr>
-        <w:t xml:space="preserve">culturalDepthScore: Float? — additional metric from cultural_engagement_analysis</w:t>
-      </w:r>
-    </w:p>
-    <w:p>
-      <w:pPr>
-        <w:pStyle w:val="ListParagraph"/>
-        <w:numPr>
-          <w:ilvl w:val="0"/>
-          <w:numId w:val="3"/>
-        </w:numPr>
-        <w:spacing w:after="80"/>
-      </w:pPr>
-      <w:r>
-        <w:rPr>
-          <w:rFonts w:ascii="Arial" w:cs="Arial" w:eastAsia="Arial" w:hAnsi="Arial"/>
-          <w:color w:val="333333"/>
-          <w:sz w:val="22"/>
-          <w:szCs w:val="22"/>
-        </w:rPr>
         <w:t xml:space="preserve">seasonalityData: Json? — populated by enrichment pipeline</w:t>
       </w:r>
     </w:p>
@@ -800,7 +730,7 @@
           <w:sz w:val="22"/>
           <w:szCs w:val="22"/>
         </w:rPr>
-        <w:t xml:space="preserve"> Certainty tracking expanded to 8 domains. Rhythm and CulturalEngagement certainties are tracked through the onboarding flow and stored in the tasteProfile JSON.</w:t>
+        <w:t xml:space="preserve"> Certainty tracking expanded to 8 domains.</w:t>
       </w:r>
     </w:p>
     <w:p>
@@ -1428,7 +1358,7 @@
           <w:sz w:val="22"/>
           <w:szCs w:val="22"/>
         </w:rPr>
-        <w:t xml:space="preserve"> Pipeline expanded from 8 to 12 stages. All stages operational in terrazzo-pipeline-worker/server.py.</w:t>
+        <w:t xml:space="preserve"> Pipeline expanded from 8 to 10 stages. All stages operational in terrazzo-pipeline-worker/server.py.</w:t>
       </w:r>
     </w:p>
     <w:p>
@@ -1465,7 +1395,7 @@
           <w:sz w:val="22"/>
           <w:szCs w:val="22"/>
         </w:rPr>
-        <w:t xml:space="preserve">rhythm_analysis: Extracts property tempo, day arcs, morning orientation, spontaneity tolerance</w:t>
+        <w:t xml:space="preserve">sustainability_analysis: Scores on 4 dimensions, extracts certifications and features</w:t>
       </w:r>
     </w:p>
     <w:p>
@@ -1484,44 +1414,6 @@
           <w:sz w:val="22"/>
           <w:szCs w:val="22"/>
         </w:rPr>
-        <w:t xml:space="preserve">sustainability_analysis: Scores on 4 dimensions, extracts certifications and features</w:t>
-      </w:r>
-    </w:p>
-    <w:p>
-      <w:pPr>
-        <w:pStyle w:val="ListParagraph"/>
-        <w:numPr>
-          <w:ilvl w:val="0"/>
-          <w:numId w:val="6"/>
-        </w:numPr>
-        <w:spacing w:after="80"/>
-      </w:pPr>
-      <w:r>
-        <w:rPr>
-          <w:rFonts w:ascii="Arial" w:cs="Arial" w:eastAsia="Arial" w:hAnsi="Arial"/>
-          <w:color w:val="333333"/>
-          <w:sz w:val="22"/>
-          <w:szCs w:val="22"/>
-        </w:rPr>
-        <w:t xml:space="preserve">cultural_engagement_analysis: Maps engagement depth, language barriers, local art integration</w:t>
-      </w:r>
-    </w:p>
-    <w:p>
-      <w:pPr>
-        <w:pStyle w:val="ListParagraph"/>
-        <w:numPr>
-          <w:ilvl w:val="0"/>
-          <w:numId w:val="6"/>
-        </w:numPr>
-        <w:spacing w:after="80"/>
-      </w:pPr>
-      <w:r>
-        <w:rPr>
-          <w:rFonts w:ascii="Arial" w:cs="Arial" w:eastAsia="Arial" w:hAnsi="Arial"/>
-          <w:color w:val="333333"/>
-          <w:sz w:val="22"/>
-          <w:szCs w:val="22"/>
-        </w:rPr>
         <w:t xml:space="preserve">sensory_analysis: Extracts light quality, soundscape, scent notes, material textures</w:t>
       </w:r>
     </w:p>
@@ -1626,7 +1518,7 @@
           <w:sz w:val="22"/>
           <w:szCs w:val="22"/>
         </w:rPr>
-        <w:t xml:space="preserve"> Booking history import has not been updated to extract rhythm signals, classify modality as IMPORT, or cross-reference sustainability databases.</w:t>
+        <w:t xml:space="preserve"> Booking history import has not been updated to classify modality as IMPORT, or cross-reference sustainability databases.</w:t>
       </w:r>
     </w:p>
     <w:p>
@@ -2112,7 +2004,7 @@
           <w:sz w:val="22"/>
           <w:szCs w:val="22"/>
         </w:rPr>
-        <w:t xml:space="preserve">SustainabilityBadge and RhythmVisualization components for match result cards are not yet built.</w:t>
+        <w:t xml:space="preserve">SustainabilityBadge components for match result cards are not yet built.</w:t>
       </w:r>
     </w:p>
     <w:p>
@@ -4443,7 +4335,7 @@
           <w:sz w:val="22"/>
           <w:szCs w:val="22"/>
         </w:rPr>
-        <w:t xml:space="preserve">SustainabilityBadge and RhythmVisualization frontend components</w:t>
+        <w:t xml:space="preserve">SustainabilityBadge frontend components</w:t>
       </w:r>
     </w:p>
     <w:p>

</xml_diff>